<commit_message>
linked parser and chunker + new sample files
</commit_message>
<xml_diff>
--- a/RAG/Sample Files/sample.docx
+++ b/RAG/Sample Files/sample.docx
@@ -4,712 +4,101 @@
   <w:body>
     <w:p>
       <w:pPr>
-        <w:pStyle w:val="Title"/>
+        <w:pStyle w:val="Heading1"/>
       </w:pPr>
       <w:r>
-        <w:t>Word Document Structure Parsing Benchmark</w:t>
+        <w:t>Quarterly Facilities Report — Meridian Office Park</w:t>
       </w:r>
     </w:p>
     <w:p>
       <w:pPr>
-        <w:pStyle w:val="Heading1"/>
+        <w:pStyle w:val="Heading2"/>
       </w:pPr>
       <w:r>
-        <w:t>Heading Level 2 - Record #1</w:t>
+        <w:t>Overview</w:t>
       </w:r>
     </w:p>
     <w:p>
       <w:r>
-        <w:t>This paragraph represents content record number 1 stored inside a standard OpenXML Word processing format. DOCX parsing scripts usually look for paragraph tags and document body structures to isolate text strings. Testing your RAG system against this layout ensures that headers and list items maintain their contextual grouping before embedding steps are finalized.</w:t>
+        <w:t>This report summarizes maintenance, occupancy, and safety activity across the Meridian Office Park campus for Q1. The campus comprises four buildings totaling 212,000 square feet of leased space.</w:t>
+      </w:r>
+    </w:p>
+    <w:p>
+      <w:pPr>
+        <w:pStyle w:val="Heading2"/>
+      </w:pPr>
+      <w:r>
+        <w:t>Occupancy Update</w:t>
       </w:r>
     </w:p>
     <w:p>
       <w:r>
-        <w:t>Sub-paragraph detail 1: Verification tokens are inserted here to measure parsing consistency across tables, standard text runs, and page layout divisions.</w:t>
+        <w:t>Building C reached 94 percent occupancy following the signing of a new five-year lease with Northgate Analytics, who will occupy the entire third floor beginning May 1st.</w:t>
       </w:r>
     </w:p>
     <w:p>
       <w:pPr>
-        <w:pStyle w:val="Heading1"/>
+        <w:pStyle w:val="Heading2"/>
       </w:pPr>
       <w:r>
-        <w:t>Heading Level 2 - Record #2</w:t>
+        <w:t>HVAC System Replacement</w:t>
       </w:r>
     </w:p>
     <w:p>
       <w:r>
-        <w:t>This paragraph represents content record number 2 stored inside a standard OpenXML Word processing format. DOCX parsing scripts usually look for paragraph tags and document body structures to isolate text strings. Testing your RAG system against this layout ensures that headers and list items maintain their contextual grouping before embedding steps are finalized.</w:t>
+        <w:t>The aging chiller unit serving Building A was replaced in February at a cost of $186,400, funded through the capital reserve. Post-installation testing showed a 14 percent improvement in cooling efficiency.</w:t>
+      </w:r>
+    </w:p>
+    <w:p>
+      <w:pPr>
+        <w:pStyle w:val="Heading2"/>
+      </w:pPr>
+      <w:r>
+        <w:t>Safety Inspections</w:t>
       </w:r>
     </w:p>
     <w:p>
       <w:r>
-        <w:t>Sub-paragraph detail 2: Verification tokens are inserted here to measure parsing consistency across tables, standard text runs, and page layout divisions.</w:t>
+        <w:t>Annual fire suppression inspections were completed across all four buildings with no critical findings. Two minor deficiencies in Building D's stairwell signage were corrected within the required 30-day window.</w:t>
       </w:r>
     </w:p>
     <w:p>
       <w:pPr>
-        <w:pStyle w:val="Heading1"/>
+        <w:pStyle w:val="Heading2"/>
       </w:pPr>
       <w:r>
-        <w:t>Heading Level 2 - Record #3</w:t>
+        <w:t>Parking Structure Repairs</w:t>
       </w:r>
     </w:p>
     <w:p>
       <w:r>
-        <w:t>This paragraph represents content record number 3 stored inside a standard OpenXML Word processing format. DOCX parsing scripts usually look for paragraph tags and document body structures to isolate text strings. Testing your RAG system against this layout ensures that headers and list items maintain their contextual grouping before embedding steps are finalized.</w:t>
+        <w:t>Structural engineers identified spalling concrete on level two of the parking garage. Repairs are scheduled for June and are expected to close roughly 40 spaces for approximately three weeks.</w:t>
+      </w:r>
+    </w:p>
+    <w:p>
+      <w:pPr>
+        <w:pStyle w:val="Heading2"/>
+      </w:pPr>
+      <w:r>
+        <w:t>Tenant Satisfaction Survey</w:t>
       </w:r>
     </w:p>
     <w:p>
       <w:r>
-        <w:t>Sub-paragraph detail 3: Verification tokens are inserted here to measure parsing consistency across tables, standard text runs, and page layout divisions.</w:t>
+        <w:t>The Q1 tenant survey returned an average satisfaction score of 4.2 out of 5, up from 3.9 in Q4. The most common request was for additional bicycle storage near Building B.</w:t>
       </w:r>
     </w:p>
     <w:p>
       <w:pPr>
-        <w:pStyle w:val="Heading1"/>
+        <w:pStyle w:val="Heading2"/>
       </w:pPr>
       <w:r>
-        <w:t>Heading Level 2 - Record #4</w:t>
+        <w:t>Upcoming Projects</w:t>
       </w:r>
     </w:p>
     <w:p>
       <w:r>
-        <w:t>This paragraph represents content record number 4 stored inside a standard OpenXML Word processing format. DOCX parsing scripts usually look for paragraph tags and document body structures to isolate text strings. Testing your RAG system against this layout ensures that headers and list items maintain their contextual grouping before embedding steps are finalized.</w:t>
-      </w:r>
-    </w:p>
-    <w:p>
-      <w:r>
-        <w:t>Sub-paragraph detail 4: Verification tokens are inserted here to measure parsing consistency across tables, standard text runs, and page layout divisions.</w:t>
-      </w:r>
-    </w:p>
-    <w:p>
-      <w:pPr>
-        <w:pStyle w:val="Heading1"/>
-      </w:pPr>
-      <w:r>
-        <w:t>Heading Level 2 - Record #5</w:t>
-      </w:r>
-    </w:p>
-    <w:p>
-      <w:r>
-        <w:t>This paragraph represents content record number 5 stored inside a standard OpenXML Word processing format. DOCX parsing scripts usually look for paragraph tags and document body structures to isolate text strings. Testing your RAG system against this layout ensures that headers and list items maintain their contextual grouping before embedding steps are finalized.</w:t>
-      </w:r>
-    </w:p>
-    <w:p>
-      <w:r>
-        <w:t>Sub-paragraph detail 5: Verification tokens are inserted here to measure parsing consistency across tables, standard text runs, and page layout divisions.</w:t>
-      </w:r>
-    </w:p>
-    <w:p>
-      <w:pPr>
-        <w:pStyle w:val="Heading1"/>
-      </w:pPr>
-      <w:r>
-        <w:t>Heading Level 2 - Record #6</w:t>
-      </w:r>
-    </w:p>
-    <w:p>
-      <w:r>
-        <w:t>This paragraph represents content record number 6 stored inside a standard OpenXML Word processing format. DOCX parsing scripts usually look for paragraph tags and document body structures to isolate text strings. Testing your RAG system against this layout ensures that headers and list items maintain their contextual grouping before embedding steps are finalized.</w:t>
-      </w:r>
-    </w:p>
-    <w:p>
-      <w:r>
-        <w:t>Sub-paragraph detail 6: Verification tokens are inserted here to measure parsing consistency across tables, standard text runs, and page layout divisions.</w:t>
-      </w:r>
-    </w:p>
-    <w:p>
-      <w:pPr>
-        <w:pStyle w:val="Heading1"/>
-      </w:pPr>
-      <w:r>
-        <w:t>Heading Level 2 - Record #7</w:t>
-      </w:r>
-    </w:p>
-    <w:p>
-      <w:r>
-        <w:t>This paragraph represents content record number 7 stored inside a standard OpenXML Word processing format. DOCX parsing scripts usually look for paragraph tags and document body structures to isolate text strings. Testing your RAG system against this layout ensures that headers and list items maintain their contextual grouping before embedding steps are finalized.</w:t>
-      </w:r>
-    </w:p>
-    <w:p>
-      <w:r>
-        <w:t>Sub-paragraph detail 7: Verification tokens are inserted here to measure parsing consistency across tables, standard text runs, and page layout divisions.</w:t>
-      </w:r>
-    </w:p>
-    <w:p>
-      <w:pPr>
-        <w:pStyle w:val="Heading1"/>
-      </w:pPr>
-      <w:r>
-        <w:t>Heading Level 2 - Record #8</w:t>
-      </w:r>
-    </w:p>
-    <w:p>
-      <w:r>
-        <w:t>This paragraph represents content record number 8 stored inside a standard OpenXML Word processing format. DOCX parsing scripts usually look for paragraph tags and document body structures to isolate text strings. Testing your RAG system against this layout ensures that headers and list items maintain their contextual grouping before embedding steps are finalized.</w:t>
-      </w:r>
-    </w:p>
-    <w:p>
-      <w:r>
-        <w:t>Sub-paragraph detail 8: Verification tokens are inserted here to measure parsing consistency across tables, standard text runs, and page layout divisions.</w:t>
-      </w:r>
-    </w:p>
-    <w:p>
-      <w:pPr>
-        <w:pStyle w:val="Heading1"/>
-      </w:pPr>
-      <w:r>
-        <w:t>Heading Level 2 - Record #9</w:t>
-      </w:r>
-    </w:p>
-    <w:p>
-      <w:r>
-        <w:t>This paragraph represents content record number 9 stored inside a standard OpenXML Word processing format. DOCX parsing scripts usually look for paragraph tags and document body structures to isolate text strings. Testing your RAG system against this layout ensures that headers and list items maintain their contextual grouping before embedding steps are finalized.</w:t>
-      </w:r>
-    </w:p>
-    <w:p>
-      <w:r>
-        <w:t>Sub-paragraph detail 9: Verification tokens are inserted here to measure parsing consistency across tables, standard text runs, and page layout divisions.</w:t>
-      </w:r>
-    </w:p>
-    <w:p>
-      <w:pPr>
-        <w:pStyle w:val="Heading1"/>
-      </w:pPr>
-      <w:r>
-        <w:t>Heading Level 2 - Record #10</w:t>
-      </w:r>
-    </w:p>
-    <w:p>
-      <w:r>
-        <w:t>This paragraph represents content record number 10 stored inside a standard OpenXML Word processing format. DOCX parsing scripts usually look for paragraph tags and document body structures to isolate text strings. Testing your RAG system against this layout ensures that headers and list items maintain their contextual grouping before embedding steps are finalized.</w:t>
-      </w:r>
-    </w:p>
-    <w:p>
-      <w:r>
-        <w:t>Sub-paragraph detail 10: Verification tokens are inserted here to measure parsing consistency across tables, standard text runs, and page layout divisions.</w:t>
-      </w:r>
-    </w:p>
-    <w:p>
-      <w:pPr>
-        <w:pStyle w:val="Heading1"/>
-      </w:pPr>
-      <w:r>
-        <w:t>Heading Level 2 - Record #11</w:t>
-      </w:r>
-    </w:p>
-    <w:p>
-      <w:r>
-        <w:t>This paragraph represents content record number 11 stored inside a standard OpenXML Word processing format. DOCX parsing scripts usually look for paragraph tags and document body structures to isolate text strings. Testing your RAG system against this layout ensures that headers and list items maintain their contextual grouping before embedding steps are finalized.</w:t>
-      </w:r>
-    </w:p>
-    <w:p>
-      <w:r>
-        <w:t>Sub-paragraph detail 11: Verification tokens are inserted here to measure parsing consistency across tables, standard text runs, and page layout divisions.</w:t>
-      </w:r>
-    </w:p>
-    <w:p>
-      <w:pPr>
-        <w:pStyle w:val="Heading1"/>
-      </w:pPr>
-      <w:r>
-        <w:t>Heading Level 2 - Record #12</w:t>
-      </w:r>
-    </w:p>
-    <w:p>
-      <w:r>
-        <w:t>This paragraph represents content record number 12 stored inside a standard OpenXML Word processing format. DOCX parsing scripts usually look for paragraph tags and document body structures to isolate text strings. Testing your RAG system against this layout ensures that headers and list items maintain their contextual grouping before embedding steps are finalized.</w:t>
-      </w:r>
-    </w:p>
-    <w:p>
-      <w:r>
-        <w:t>Sub-paragraph detail 12: Verification tokens are inserted here to measure parsing consistency across tables, standard text runs, and page layout divisions.</w:t>
-      </w:r>
-    </w:p>
-    <w:p>
-      <w:pPr>
-        <w:pStyle w:val="Heading1"/>
-      </w:pPr>
-      <w:r>
-        <w:t>Heading Level 2 - Record #13</w:t>
-      </w:r>
-    </w:p>
-    <w:p>
-      <w:r>
-        <w:t>This paragraph represents content record number 13 stored inside a standard OpenXML Word processing format. DOCX parsing scripts usually look for paragraph tags and document body structures to isolate text strings. Testing your RAG system against this layout ensures that headers and list items maintain their contextual grouping before embedding steps are finalized.</w:t>
-      </w:r>
-    </w:p>
-    <w:p>
-      <w:r>
-        <w:t>Sub-paragraph detail 13: Verification tokens are inserted here to measure parsing consistency across tables, standard text runs, and page layout divisions.</w:t>
-      </w:r>
-    </w:p>
-    <w:p>
-      <w:pPr>
-        <w:pStyle w:val="Heading1"/>
-      </w:pPr>
-      <w:r>
-        <w:t>Heading Level 2 - Record #14</w:t>
-      </w:r>
-    </w:p>
-    <w:p>
-      <w:r>
-        <w:t>This paragraph represents content record number 14 stored inside a standard OpenXML Word processing format. DOCX parsing scripts usually look for paragraph tags and document body structures to isolate text strings. Testing your RAG system against this layout ensures that headers and list items maintain their contextual grouping before embedding steps are finalized.</w:t>
-      </w:r>
-    </w:p>
-    <w:p>
-      <w:r>
-        <w:t>Sub-paragraph detail 14: Verification tokens are inserted here to measure parsing consistency across tables, standard text runs, and page layout divisions.</w:t>
-      </w:r>
-    </w:p>
-    <w:p>
-      <w:pPr>
-        <w:pStyle w:val="Heading1"/>
-      </w:pPr>
-      <w:r>
-        <w:t>Heading Level 2 - Record #15</w:t>
-      </w:r>
-    </w:p>
-    <w:p>
-      <w:r>
-        <w:t>This paragraph represents content record number 15 stored inside a standard OpenXML Word processing format. DOCX parsing scripts usually look for paragraph tags and document body structures to isolate text strings. Testing your RAG system against this layout ensures that headers and list items maintain their contextual grouping before embedding steps are finalized.</w:t>
-      </w:r>
-    </w:p>
-    <w:p>
-      <w:r>
-        <w:t>Sub-paragraph detail 15: Verification tokens are inserted here to measure parsing consistency across tables, standard text runs, and page layout divisions.</w:t>
-      </w:r>
-    </w:p>
-    <w:p>
-      <w:pPr>
-        <w:pStyle w:val="Heading1"/>
-      </w:pPr>
-      <w:r>
-        <w:t>Heading Level 2 - Record #16</w:t>
-      </w:r>
-    </w:p>
-    <w:p>
-      <w:r>
-        <w:t>This paragraph represents content record number 16 stored inside a standard OpenXML Word processing format. DOCX parsing scripts usually look for paragraph tags and document body structures to isolate text strings. Testing your RAG system against this layout ensures that headers and list items maintain their contextual grouping before embedding steps are finalized.</w:t>
-      </w:r>
-    </w:p>
-    <w:p>
-      <w:r>
-        <w:t>Sub-paragraph detail 16: Verification tokens are inserted here to measure parsing consistency across tables, standard text runs, and page layout divisions.</w:t>
-      </w:r>
-    </w:p>
-    <w:p>
-      <w:pPr>
-        <w:pStyle w:val="Heading1"/>
-      </w:pPr>
-      <w:r>
-        <w:t>Heading Level 2 - Record #17</w:t>
-      </w:r>
-    </w:p>
-    <w:p>
-      <w:r>
-        <w:t>This paragraph represents content record number 17 stored inside a standard OpenXML Word processing format. DOCX parsing scripts usually look for paragraph tags and document body structures to isolate text strings. Testing your RAG system against this layout ensures that headers and list items maintain their contextual grouping before embedding steps are finalized.</w:t>
-      </w:r>
-    </w:p>
-    <w:p>
-      <w:r>
-        <w:t>Sub-paragraph detail 17: Verification tokens are inserted here to measure parsing consistency across tables, standard text runs, and page layout divisions.</w:t>
-      </w:r>
-    </w:p>
-    <w:p>
-      <w:pPr>
-        <w:pStyle w:val="Heading1"/>
-      </w:pPr>
-      <w:r>
-        <w:t>Heading Level 2 - Record #18</w:t>
-      </w:r>
-    </w:p>
-    <w:p>
-      <w:r>
-        <w:t>This paragraph represents content record number 18 stored inside a standard OpenXML Word processing format. DOCX parsing scripts usually look for paragraph tags and document body structures to isolate text strings. Testing your RAG system against this layout ensures that headers and list items maintain their contextual grouping before embedding steps are finalized.</w:t>
-      </w:r>
-    </w:p>
-    <w:p>
-      <w:r>
-        <w:t>Sub-paragraph detail 18: Verification tokens are inserted here to measure parsing consistency across tables, standard text runs, and page layout divisions.</w:t>
-      </w:r>
-    </w:p>
-    <w:p>
-      <w:pPr>
-        <w:pStyle w:val="Heading1"/>
-      </w:pPr>
-      <w:r>
-        <w:t>Heading Level 2 - Record #19</w:t>
-      </w:r>
-    </w:p>
-    <w:p>
-      <w:r>
-        <w:t>This paragraph represents content record number 19 stored inside a standard OpenXML Word processing format. DOCX parsing scripts usually look for paragraph tags and document body structures to isolate text strings. Testing your RAG system against this layout ensures that headers and list items maintain their contextual grouping before embedding steps are finalized.</w:t>
-      </w:r>
-    </w:p>
-    <w:p>
-      <w:r>
-        <w:t>Sub-paragraph detail 19: Verification tokens are inserted here to measure parsing consistency across tables, standard text runs, and page layout divisions.</w:t>
-      </w:r>
-    </w:p>
-    <w:p>
-      <w:pPr>
-        <w:pStyle w:val="Heading1"/>
-      </w:pPr>
-      <w:r>
-        <w:t>Heading Level 2 - Record #20</w:t>
-      </w:r>
-    </w:p>
-    <w:p>
-      <w:r>
-        <w:t>This paragraph represents content record number 20 stored inside a standard OpenXML Word processing format. DOCX parsing scripts usually look for paragraph tags and document body structures to isolate text strings. Testing your RAG system against this layout ensures that headers and list items maintain their contextual grouping before embedding steps are finalized.</w:t>
-      </w:r>
-    </w:p>
-    <w:p>
-      <w:r>
-        <w:t>Sub-paragraph detail 20: Verification tokens are inserted here to measure parsing consistency across tables, standard text runs, and page layout divisions.</w:t>
-      </w:r>
-    </w:p>
-    <w:p>
-      <w:pPr>
-        <w:pStyle w:val="Heading1"/>
-      </w:pPr>
-      <w:r>
-        <w:t>Heading Level 2 - Record #21</w:t>
-      </w:r>
-    </w:p>
-    <w:p>
-      <w:r>
-        <w:t>This paragraph represents content record number 21 stored inside a standard OpenXML Word processing format. DOCX parsing scripts usually look for paragraph tags and document body structures to isolate text strings. Testing your RAG system against this layout ensures that headers and list items maintain their contextual grouping before embedding steps are finalized.</w:t>
-      </w:r>
-    </w:p>
-    <w:p>
-      <w:r>
-        <w:t>Sub-paragraph detail 21: Verification tokens are inserted here to measure parsing consistency across tables, standard text runs, and page layout divisions.</w:t>
-      </w:r>
-    </w:p>
-    <w:p>
-      <w:pPr>
-        <w:pStyle w:val="Heading1"/>
-      </w:pPr>
-      <w:r>
-        <w:t>Heading Level 2 - Record #22</w:t>
-      </w:r>
-    </w:p>
-    <w:p>
-      <w:r>
-        <w:t>This paragraph represents content record number 22 stored inside a standard OpenXML Word processing format. DOCX parsing scripts usually look for paragraph tags and document body structures to isolate text strings. Testing your RAG system against this layout ensures that headers and list items maintain their contextual grouping before embedding steps are finalized.</w:t>
-      </w:r>
-    </w:p>
-    <w:p>
-      <w:r>
-        <w:t>Sub-paragraph detail 22: Verification tokens are inserted here to measure parsing consistency across tables, standard text runs, and page layout divisions.</w:t>
-      </w:r>
-    </w:p>
-    <w:p>
-      <w:pPr>
-        <w:pStyle w:val="Heading1"/>
-      </w:pPr>
-      <w:r>
-        <w:t>Heading Level 2 - Record #23</w:t>
-      </w:r>
-    </w:p>
-    <w:p>
-      <w:r>
-        <w:t>This paragraph represents content record number 23 stored inside a standard OpenXML Word processing format. DOCX parsing scripts usually look for paragraph tags and document body structures to isolate text strings. Testing your RAG system against this layout ensures that headers and list items maintain their contextual grouping before embedding steps are finalized.</w:t>
-      </w:r>
-    </w:p>
-    <w:p>
-      <w:r>
-        <w:t>Sub-paragraph detail 23: Verification tokens are inserted here to measure parsing consistency across tables, standard text runs, and page layout divisions.</w:t>
-      </w:r>
-    </w:p>
-    <w:p>
-      <w:pPr>
-        <w:pStyle w:val="Heading1"/>
-      </w:pPr>
-      <w:r>
-        <w:t>Heading Level 2 - Record #24</w:t>
-      </w:r>
-    </w:p>
-    <w:p>
-      <w:r>
-        <w:t>This paragraph represents content record number 24 stored inside a standard OpenXML Word processing format. DOCX parsing scripts usually look for paragraph tags and document body structures to isolate text strings. Testing your RAG system against this layout ensures that headers and list items maintain their contextual grouping before embedding steps are finalized.</w:t>
-      </w:r>
-    </w:p>
-    <w:p>
-      <w:r>
-        <w:t>Sub-paragraph detail 24: Verification tokens are inserted here to measure parsing consistency across tables, standard text runs, and page layout divisions.</w:t>
-      </w:r>
-    </w:p>
-    <w:p>
-      <w:pPr>
-        <w:pStyle w:val="Heading1"/>
-      </w:pPr>
-      <w:r>
-        <w:t>Heading Level 2 - Record #25</w:t>
-      </w:r>
-    </w:p>
-    <w:p>
-      <w:r>
-        <w:t>This paragraph represents content record number 25 stored inside a standard OpenXML Word processing format. DOCX parsing scripts usually look for paragraph tags and document body structures to isolate text strings. Testing your RAG system against this layout ensures that headers and list items maintain their contextual grouping before embedding steps are finalized.</w:t>
-      </w:r>
-    </w:p>
-    <w:p>
-      <w:r>
-        <w:t>Sub-paragraph detail 25: Verification tokens are inserted here to measure parsing consistency across tables, standard text runs, and page layout divisions.</w:t>
-      </w:r>
-    </w:p>
-    <w:p>
-      <w:pPr>
-        <w:pStyle w:val="Heading1"/>
-      </w:pPr>
-      <w:r>
-        <w:t>Heading Level 2 - Record #26</w:t>
-      </w:r>
-    </w:p>
-    <w:p>
-      <w:r>
-        <w:t>This paragraph represents content record number 26 stored inside a standard OpenXML Word processing format. DOCX parsing scripts usually look for paragraph tags and document body structures to isolate text strings. Testing your RAG system against this layout ensures that headers and list items maintain their contextual grouping before embedding steps are finalized.</w:t>
-      </w:r>
-    </w:p>
-    <w:p>
-      <w:r>
-        <w:t>Sub-paragraph detail 26: Verification tokens are inserted here to measure parsing consistency across tables, standard text runs, and page layout divisions.</w:t>
-      </w:r>
-    </w:p>
-    <w:p>
-      <w:pPr>
-        <w:pStyle w:val="Heading1"/>
-      </w:pPr>
-      <w:r>
-        <w:t>Heading Level 2 - Record #27</w:t>
-      </w:r>
-    </w:p>
-    <w:p>
-      <w:r>
-        <w:t>This paragraph represents content record number 27 stored inside a standard OpenXML Word processing format. DOCX parsing scripts usually look for paragraph tags and document body structures to isolate text strings. Testing your RAG system against this layout ensures that headers and list items maintain their contextual grouping before embedding steps are finalized.</w:t>
-      </w:r>
-    </w:p>
-    <w:p>
-      <w:r>
-        <w:t>Sub-paragraph detail 27: Verification tokens are inserted here to measure parsing consistency across tables, standard text runs, and page layout divisions.</w:t>
-      </w:r>
-    </w:p>
-    <w:p>
-      <w:pPr>
-        <w:pStyle w:val="Heading1"/>
-      </w:pPr>
-      <w:r>
-        <w:t>Heading Level 2 - Record #28</w:t>
-      </w:r>
-    </w:p>
-    <w:p>
-      <w:r>
-        <w:t>This paragraph represents content record number 28 stored inside a standard OpenXML Word processing format. DOCX parsing scripts usually look for paragraph tags and document body structures to isolate text strings. Testing your RAG system against this layout ensures that headers and list items maintain their contextual grouping before embedding steps are finalized.</w:t>
-      </w:r>
-    </w:p>
-    <w:p>
-      <w:r>
-        <w:t>Sub-paragraph detail 28: Verification tokens are inserted here to measure parsing consistency across tables, standard text runs, and page layout divisions.</w:t>
-      </w:r>
-    </w:p>
-    <w:p>
-      <w:pPr>
-        <w:pStyle w:val="Heading1"/>
-      </w:pPr>
-      <w:r>
-        <w:t>Heading Level 2 - Record #29</w:t>
-      </w:r>
-    </w:p>
-    <w:p>
-      <w:r>
-        <w:t>This paragraph represents content record number 29 stored inside a standard OpenXML Word processing format. DOCX parsing scripts usually look for paragraph tags and document body structures to isolate text strings. Testing your RAG system against this layout ensures that headers and list items maintain their contextual grouping before embedding steps are finalized.</w:t>
-      </w:r>
-    </w:p>
-    <w:p>
-      <w:r>
-        <w:t>Sub-paragraph detail 29: Verification tokens are inserted here to measure parsing consistency across tables, standard text runs, and page layout divisions.</w:t>
-      </w:r>
-    </w:p>
-    <w:p>
-      <w:pPr>
-        <w:pStyle w:val="Heading1"/>
-      </w:pPr>
-      <w:r>
-        <w:t>Heading Level 2 - Record #30</w:t>
-      </w:r>
-    </w:p>
-    <w:p>
-      <w:r>
-        <w:t>This paragraph represents content record number 30 stored inside a standard OpenXML Word processing format. DOCX parsing scripts usually look for paragraph tags and document body structures to isolate text strings. Testing your RAG system against this layout ensures that headers and list items maintain their contextual grouping before embedding steps are finalized.</w:t>
-      </w:r>
-    </w:p>
-    <w:p>
-      <w:r>
-        <w:t>Sub-paragraph detail 30: Verification tokens are inserted here to measure parsing consistency across tables, standard text runs, and page layout divisions.</w:t>
-      </w:r>
-    </w:p>
-    <w:p>
-      <w:pPr>
-        <w:pStyle w:val="Heading1"/>
-      </w:pPr>
-      <w:r>
-        <w:t>Heading Level 2 - Record #31</w:t>
-      </w:r>
-    </w:p>
-    <w:p>
-      <w:r>
-        <w:t>This paragraph represents content record number 31 stored inside a standard OpenXML Word processing format. DOCX parsing scripts usually look for paragraph tags and document body structures to isolate text strings. Testing your RAG system against this layout ensures that headers and list items maintain their contextual grouping before embedding steps are finalized.</w:t>
-      </w:r>
-    </w:p>
-    <w:p>
-      <w:r>
-        <w:t>Sub-paragraph detail 31: Verification tokens are inserted here to measure parsing consistency across tables, standard text runs, and page layout divisions.</w:t>
-      </w:r>
-    </w:p>
-    <w:p>
-      <w:pPr>
-        <w:pStyle w:val="Heading1"/>
-      </w:pPr>
-      <w:r>
-        <w:t>Heading Level 2 - Record #32</w:t>
-      </w:r>
-    </w:p>
-    <w:p>
-      <w:r>
-        <w:t>This paragraph represents content record number 32 stored inside a standard OpenXML Word processing format. DOCX parsing scripts usually look for paragraph tags and document body structures to isolate text strings. Testing your RAG system against this layout ensures that headers and list items maintain their contextual grouping before embedding steps are finalized.</w:t>
-      </w:r>
-    </w:p>
-    <w:p>
-      <w:r>
-        <w:t>Sub-paragraph detail 32: Verification tokens are inserted here to measure parsing consistency across tables, standard text runs, and page layout divisions.</w:t>
-      </w:r>
-    </w:p>
-    <w:p>
-      <w:pPr>
-        <w:pStyle w:val="Heading1"/>
-      </w:pPr>
-      <w:r>
-        <w:t>Heading Level 2 - Record #33</w:t>
-      </w:r>
-    </w:p>
-    <w:p>
-      <w:r>
-        <w:t>This paragraph represents content record number 33 stored inside a standard OpenXML Word processing format. DOCX parsing scripts usually look for paragraph tags and document body structures to isolate text strings. Testing your RAG system against this layout ensures that headers and list items maintain their contextual grouping before embedding steps are finalized.</w:t>
-      </w:r>
-    </w:p>
-    <w:p>
-      <w:r>
-        <w:t>Sub-paragraph detail 33: Verification tokens are inserted here to measure parsing consistency across tables, standard text runs, and page layout divisions.</w:t>
-      </w:r>
-    </w:p>
-    <w:p>
-      <w:pPr>
-        <w:pStyle w:val="Heading1"/>
-      </w:pPr>
-      <w:r>
-        <w:t>Heading Level 2 - Record #34</w:t>
-      </w:r>
-    </w:p>
-    <w:p>
-      <w:r>
-        <w:t>This paragraph represents content record number 34 stored inside a standard OpenXML Word processing format. DOCX parsing scripts usually look for paragraph tags and document body structures to isolate text strings. Testing your RAG system against this layout ensures that headers and list items maintain their contextual grouping before embedding steps are finalized.</w:t>
-      </w:r>
-    </w:p>
-    <w:p>
-      <w:r>
-        <w:t>Sub-paragraph detail 34: Verification tokens are inserted here to measure parsing consistency across tables, standard text runs, and page layout divisions.</w:t>
-      </w:r>
-    </w:p>
-    <w:p>
-      <w:pPr>
-        <w:pStyle w:val="Heading1"/>
-      </w:pPr>
-      <w:r>
-        <w:t>Heading Level 2 - Record #35</w:t>
-      </w:r>
-    </w:p>
-    <w:p>
-      <w:r>
-        <w:t>This paragraph represents content record number 35 stored inside a standard OpenXML Word processing format. DOCX parsing scripts usually look for paragraph tags and document body structures to isolate text strings. Testing your RAG system against this layout ensures that headers and list items maintain their contextual grouping before embedding steps are finalized.</w:t>
-      </w:r>
-    </w:p>
-    <w:p>
-      <w:r>
-        <w:t>Sub-paragraph detail 35: Verification tokens are inserted here to measure parsing consistency across tables, standard text runs, and page layout divisions.</w:t>
-      </w:r>
-    </w:p>
-    <w:p>
-      <w:pPr>
-        <w:pStyle w:val="Heading1"/>
-      </w:pPr>
-      <w:r>
-        <w:t>Heading Level 2 - Record #36</w:t>
-      </w:r>
-    </w:p>
-    <w:p>
-      <w:r>
-        <w:t>This paragraph represents content record number 36 stored inside a standard OpenXML Word processing format. DOCX parsing scripts usually look for paragraph tags and document body structures to isolate text strings. Testing your RAG system against this layout ensures that headers and list items maintain their contextual grouping before embedding steps are finalized.</w:t>
-      </w:r>
-    </w:p>
-    <w:p>
-      <w:r>
-        <w:t>Sub-paragraph detail 36: Verification tokens are inserted here to measure parsing consistency across tables, standard text runs, and page layout divisions.</w:t>
-      </w:r>
-    </w:p>
-    <w:p>
-      <w:pPr>
-        <w:pStyle w:val="Heading1"/>
-      </w:pPr>
-      <w:r>
-        <w:t>Heading Level 2 - Record #37</w:t>
-      </w:r>
-    </w:p>
-    <w:p>
-      <w:r>
-        <w:t>This paragraph represents content record number 37 stored inside a standard OpenXML Word processing format. DOCX parsing scripts usually look for paragraph tags and document body structures to isolate text strings. Testing your RAG system against this layout ensures that headers and list items maintain their contextual grouping before embedding steps are finalized.</w:t>
-      </w:r>
-    </w:p>
-    <w:p>
-      <w:r>
-        <w:t>Sub-paragraph detail 37: Verification tokens are inserted here to measure parsing consistency across tables, standard text runs, and page layout divisions.</w:t>
-      </w:r>
-    </w:p>
-    <w:p>
-      <w:pPr>
-        <w:pStyle w:val="Heading1"/>
-      </w:pPr>
-      <w:r>
-        <w:t>Heading Level 2 - Record #38</w:t>
-      </w:r>
-    </w:p>
-    <w:p>
-      <w:r>
-        <w:t>This paragraph represents content record number 38 stored inside a standard OpenXML Word processing format. DOCX parsing scripts usually look for paragraph tags and document body structures to isolate text strings. Testing your RAG system against this layout ensures that headers and list items maintain their contextual grouping before embedding steps are finalized.</w:t>
-      </w:r>
-    </w:p>
-    <w:p>
-      <w:r>
-        <w:t>Sub-paragraph detail 38: Verification tokens are inserted here to measure parsing consistency across tables, standard text runs, and page layout divisions.</w:t>
-      </w:r>
-    </w:p>
-    <w:p>
-      <w:pPr>
-        <w:pStyle w:val="Heading1"/>
-      </w:pPr>
-      <w:r>
-        <w:t>Heading Level 2 - Record #39</w:t>
-      </w:r>
-    </w:p>
-    <w:p>
-      <w:r>
-        <w:t>This paragraph represents content record number 39 stored inside a standard OpenXML Word processing format. DOCX parsing scripts usually look for paragraph tags and document body structures to isolate text strings. Testing your RAG system against this layout ensures that headers and list items maintain their contextual grouping before embedding steps are finalized.</w:t>
-      </w:r>
-    </w:p>
-    <w:p>
-      <w:r>
-        <w:t>Sub-paragraph detail 39: Verification tokens are inserted here to measure parsing consistency across tables, standard text runs, and page layout divisions.</w:t>
+        <w:t>Planned work for Q2 includes resurfacing the main parking lot, upgrading exterior lighting to LED fixtures across the campus, and installing EV charging stations near the Building A entrance.</w:t>
       </w:r>
     </w:p>
     <w:sectPr>

</xml_diff>